<commit_message>
update tai lieu, them ten
</commit_message>
<xml_diff>
--- a/CTDL-BTL-02-QuanLyBanHangSieuThi-BaoCao.docx
+++ b/CTDL-BTL-02-QuanLyBanHangSieuThi-BaoCao.docx
@@ -166,39 +166,34 @@
     <w:p>
       <w:pPr>
         <w:jc w:val="center"/>
+        <w:rPr>
+          <w:lang w:val="vi-VN"/>
+        </w:rPr>
       </w:pPr>
       <w:r>
-        <w:rPr>
-          <w:i/>
-        </w:rPr>
-        <w:t>(Đi</w:t>
-      </w:r>
-      <w:r>
-        <w:rPr>
-          <w:i/>
-        </w:rPr>
-        <w:t>ề</w:t>
-      </w:r>
-      <w:r>
-        <w:rPr>
-          <w:i/>
-        </w:rPr>
-        <w:t>n danh sách thành viên nhóm t</w:t>
-      </w:r>
-      <w:r>
-        <w:rPr>
-          <w:i/>
-        </w:rPr>
-        <w:t>ạ</w:t>
-      </w:r>
-      <w:r>
-        <w:rPr>
-          <w:i/>
-        </w:rPr>
-        <w:t>i đây)</w:t>
+        <w:t>NGÔ</w:t>
+      </w:r>
+      <w:r>
+        <w:rPr>
+          <w:lang w:val="vi-VN"/>
+        </w:rPr>
+        <w:t xml:space="preserve"> VĨNH TOÀN – CNT323</w:t>
       </w:r>
     </w:p>
-    <w:p/>
+    <w:p>
+      <w:pPr>
+        <w:jc w:val="center"/>
+        <w:rPr>
+          <w:lang w:val="vi-VN"/>
+        </w:rPr>
+      </w:pPr>
+      <w:r>
+        <w:rPr>
+          <w:lang w:val="vi-VN"/>
+        </w:rPr>
+        <w:t>LƯU QUANG TÙNG – CNT323</w:t>
+      </w:r>
+    </w:p>
     <w:p/>
     <w:p/>
     <w:p/>
@@ -375,37 +370,6 @@
     <w:p/>
     <w:p/>
     <w:p/>
-    <w:p/>
-    <w:p/>
-    <w:p>
-      <w:pPr>
-        <w:jc w:val="right"/>
-      </w:pPr>
-      <w:r>
-        <w:t>Gi</w:t>
-      </w:r>
-      <w:r>
-        <w:t>ả</w:t>
-      </w:r>
-      <w:r>
-        <w:t>ng viên hư</w:t>
-      </w:r>
-      <w:r>
-        <w:t>ớ</w:t>
-      </w:r>
-      <w:r>
-        <w:t xml:space="preserve">ng </w:t>
-      </w:r>
-      <w:r>
-        <w:t>d</w:t>
-      </w:r>
-      <w:r>
-        <w:t>ẫ</w:t>
-      </w:r>
-      <w:r>
-        <w:t>n: ................................</w:t>
-      </w:r>
-    </w:p>
     <w:p/>
     <w:p/>
     <w:p/>
@@ -5864,6 +5828,11 @@
       </w:r>
     </w:p>
     <w:p>
+      <w:pPr>
+        <w:rPr>
+          <w:lang w:val="vi-VN"/>
+        </w:rPr>
+      </w:pPr>
       <w:r>
         <w:t>Chương trình có th</w:t>
       </w:r>
@@ -5982,8 +5951,40 @@
         <w:t>ọ</w:t>
       </w:r>
       <w:r>
-        <w:t>c/lưu file và hàm menu chính.</w:t>
-      </w:r>
+        <w:t xml:space="preserve">c/lưu file </w:t>
+      </w:r>
+      <w:proofErr w:type="spellStart"/>
+      <w:r>
+        <w:t>và</w:t>
+      </w:r>
+      <w:proofErr w:type="spellEnd"/>
+      <w:r>
+        <w:t xml:space="preserve"> </w:t>
+      </w:r>
+      <w:proofErr w:type="spellStart"/>
+      <w:r>
+        <w:t>hàm</w:t>
+      </w:r>
+      <w:proofErr w:type="spellEnd"/>
+      <w:r>
+        <w:t xml:space="preserve"> menu </w:t>
+      </w:r>
+      <w:proofErr w:type="spellStart"/>
+      <w:r>
+        <w:t>chính</w:t>
+      </w:r>
+      <w:proofErr w:type="spellEnd"/>
+      <w:r>
+        <w:t>.</w:t>
+      </w:r>
+      <w:r>
+        <w:rPr>
+          <w:lang w:val="vi-VN"/>
+        </w:rPr>
+        <w:t xml:space="preserve"> Sử dụng file txt làm cơ sở dữ liệu</w:t>
+      </w:r>
+      <w:bookmarkStart w:id="0" w:name="_GoBack"/>
+      <w:bookmarkEnd w:id="0"/>
     </w:p>
     <w:p>
       <w:pPr>
@@ -6767,10 +6768,26 @@
           <w:sz w:val="21"/>
           <w:lang w:val="vi-VN"/>
         </w:rPr>
-        <w:t xml:space="preserve"> theo đơn giá tăng dần</w:t>
-      </w:r>
-      <w:bookmarkStart w:id="0" w:name="_GoBack"/>
-      <w:bookmarkEnd w:id="0"/>
+        <w:t xml:space="preserve"> </w:t>
+      </w:r>
+      <w:proofErr w:type="gramStart"/>
+      <w:r>
+        <w:rPr>
+          <w:rFonts w:ascii="Courier New" w:hAnsi="Courier New"/>
+          <w:sz w:val="21"/>
+          <w:lang w:val="vi-VN"/>
+        </w:rPr>
+        <w:t>theo</w:t>
+      </w:r>
+      <w:proofErr w:type="gramEnd"/>
+      <w:r>
+        <w:rPr>
+          <w:rFonts w:ascii="Courier New" w:hAnsi="Courier New"/>
+          <w:sz w:val="21"/>
+          <w:lang w:val="vi-VN"/>
+        </w:rPr>
+        <w:t xml:space="preserve"> đơn giá tăng dần</w:t>
+      </w:r>
     </w:p>
     <w:p>
       <w:pPr>
@@ -7255,32 +7272,136 @@
       </w:r>
     </w:p>
     <w:p>
-      <w:r>
-        <w:t>[Chèn thêm code chương trình chính t</w:t>
-      </w:r>
-      <w:r>
-        <w:t>ạ</w:t>
-      </w:r>
-      <w:r>
-        <w:t>i đây sau khi hoàn thi</w:t>
-      </w:r>
-      <w:r>
-        <w:t>ệ</w:t>
-      </w:r>
-      <w:r>
-        <w:t>n ph</w:t>
-      </w:r>
-      <w:r>
-        <w:t>ầ</w:t>
-      </w:r>
-      <w:r>
-        <w:t>n l</w:t>
-      </w:r>
-      <w:r>
-        <w:t>ậ</w:t>
-      </w:r>
-      <w:r>
-        <w:t>p trình.]</w:t>
+      <w:pPr>
+        <w:rPr>
+          <w:b/>
+          <w:color w:val="FF0000"/>
+        </w:rPr>
+      </w:pPr>
+    </w:p>
+    <w:p>
+      <w:pPr>
+        <w:rPr>
+          <w:b/>
+          <w:color w:val="FF0000"/>
+        </w:rPr>
+      </w:pPr>
+    </w:p>
+    <w:p>
+      <w:pPr>
+        <w:rPr>
+          <w:b/>
+          <w:color w:val="FF0000"/>
+          <w:lang w:val="vi-VN"/>
+        </w:rPr>
+      </w:pPr>
+      <w:r>
+        <w:rPr>
+          <w:b/>
+          <w:color w:val="FF0000"/>
+        </w:rPr>
+        <w:t>Menu</w:t>
+      </w:r>
+      <w:r>
+        <w:rPr>
+          <w:b/>
+          <w:color w:val="FF0000"/>
+          <w:lang w:val="vi-VN"/>
+        </w:rPr>
+        <w:t xml:space="preserve"> chương trình sau khi xây dựng:</w:t>
+      </w:r>
+    </w:p>
+    <w:p>
+      <w:pPr>
+        <w:rPr>
+          <w:b/>
+          <w:color w:val="FF0000"/>
+          <w:lang w:val="vi-VN"/>
+        </w:rPr>
+      </w:pPr>
+      <w:r>
+        <w:rPr>
+          <w:noProof/>
+        </w:rPr>
+        <w:drawing>
+          <wp:inline distT="0" distB="0" distL="0" distR="0" wp14:anchorId="645BC2F2" wp14:editId="138B1FA0">
+            <wp:extent cx="4476750" cy="2286000"/>
+            <wp:effectExtent l="0" t="0" r="0" b="0"/>
+            <wp:docPr id="1" name="Picture 1"/>
+            <wp:cNvGraphicFramePr>
+              <a:graphicFrameLocks xmlns:a="http://schemas.openxmlformats.org/drawingml/2006/main" noChangeAspect="1"/>
+            </wp:cNvGraphicFramePr>
+            <a:graphic xmlns:a="http://schemas.openxmlformats.org/drawingml/2006/main">
+              <a:graphicData uri="http://schemas.openxmlformats.org/drawingml/2006/picture">
+                <pic:pic xmlns:pic="http://schemas.openxmlformats.org/drawingml/2006/picture">
+                  <pic:nvPicPr>
+                    <pic:cNvPr id="1" name=""/>
+                    <pic:cNvPicPr/>
+                  </pic:nvPicPr>
+                  <pic:blipFill>
+                    <a:blip r:embed="rId6"/>
+                    <a:stretch>
+                      <a:fillRect/>
+                    </a:stretch>
+                  </pic:blipFill>
+                  <pic:spPr>
+                    <a:xfrm>
+                      <a:off x="0" y="0"/>
+                      <a:ext cx="4476750" cy="2286000"/>
+                    </a:xfrm>
+                    <a:prstGeom prst="rect">
+                      <a:avLst/>
+                    </a:prstGeom>
+                  </pic:spPr>
+                </pic:pic>
+              </a:graphicData>
+            </a:graphic>
+          </wp:inline>
+        </w:drawing>
+      </w:r>
+    </w:p>
+    <w:p>
+      <w:pPr>
+        <w:rPr>
+          <w:b/>
+          <w:color w:val="FF0000"/>
+          <w:lang w:val="vi-VN"/>
+        </w:rPr>
+      </w:pPr>
+      <w:proofErr w:type="spellStart"/>
+      <w:r>
+        <w:rPr>
+          <w:b/>
+          <w:color w:val="FF0000"/>
+        </w:rPr>
+        <w:t>Mã</w:t>
+      </w:r>
+      <w:proofErr w:type="spellEnd"/>
+      <w:r>
+        <w:rPr>
+          <w:b/>
+          <w:color w:val="FF0000"/>
+          <w:lang w:val="vi-VN"/>
+        </w:rPr>
+        <w:t xml:space="preserve"> nguồn được đính kèm tại </w:t>
+      </w:r>
+      <w:proofErr w:type="gramStart"/>
+      <w:r>
+        <w:rPr>
+          <w:b/>
+          <w:color w:val="FF0000"/>
+          <w:lang w:val="vi-VN"/>
+        </w:rPr>
+        <w:t>thư</w:t>
+      </w:r>
+      <w:proofErr w:type="gramEnd"/>
+      <w:r>
+        <w:rPr>
+          <w:b/>
+          <w:color w:val="FF0000"/>
+          <w:lang w:val="vi-VN"/>
+        </w:rPr>
+        <w:t xml:space="preserve"> mục dự án</w:t>
       </w:r>
     </w:p>
     <w:p>
@@ -7288,7 +7409,6 @@
         <w:pStyle w:val="Heading1"/>
       </w:pPr>
       <w:r>
-        <w:lastRenderedPageBreak/>
         <w:t>6. KI</w:t>
       </w:r>
       <w:r>
@@ -8174,19 +8294,57 @@
           </w:tcPr>
           <w:p>
             <w:r>
-              <w:t>Tìm s</w:t>
+              <w:rPr>
+                <w:lang w:val="vi-VN"/>
+              </w:rPr>
+              <w:t xml:space="preserve"> Cập nhật</w:t>
+            </w:r>
+            <w:r>
+              <w:t xml:space="preserve"> </w:t>
+            </w:r>
+            <w:proofErr w:type="spellStart"/>
+            <w:r>
+              <w:t>s</w:t>
             </w:r>
             <w:r>
               <w:t>ả</w:t>
             </w:r>
             <w:r>
-              <w:t>n ph</w:t>
+              <w:t>n</w:t>
+            </w:r>
+            <w:proofErr w:type="spellEnd"/>
+            <w:r>
+              <w:t xml:space="preserve"> </w:t>
+            </w:r>
+            <w:proofErr w:type="spellStart"/>
+            <w:r>
+              <w:t>ph</w:t>
             </w:r>
             <w:r>
               <w:t>ẩ</w:t>
             </w:r>
             <w:r>
-              <w:t>m có mã SP03</w:t>
+              <w:t>m</w:t>
+            </w:r>
+            <w:proofErr w:type="spellEnd"/>
+            <w:r>
+              <w:t xml:space="preserve"> </w:t>
+            </w:r>
+            <w:proofErr w:type="spellStart"/>
+            <w:r>
+              <w:t>có</w:t>
+            </w:r>
+            <w:proofErr w:type="spellEnd"/>
+            <w:r>
+              <w:t xml:space="preserve"> </w:t>
+            </w:r>
+            <w:proofErr w:type="spellStart"/>
+            <w:r>
+              <w:t>mã</w:t>
+            </w:r>
+            <w:proofErr w:type="spellEnd"/>
+            <w:r>
+              <w:t xml:space="preserve"> SP03</w:t>
             </w:r>
           </w:p>
         </w:tc>
@@ -8196,33 +8354,99 @@
             <w:vAlign w:val="center"/>
           </w:tcPr>
           <w:p>
-            <w:r>
-              <w:t>Hi</w:t>
-            </w:r>
-            <w:r>
-              <w:t>ể</w:t>
-            </w:r>
-            <w:r>
-              <w:t>n th</w:t>
-            </w:r>
-            <w:r>
-              <w:t>ị</w:t>
-            </w:r>
-            <w:r>
-              <w:t xml:space="preserve"> thông tin Nư</w:t>
-            </w:r>
-            <w:r>
-              <w:t>ớ</w:t>
-            </w:r>
-            <w:r>
-              <w:t>c r</w:t>
-            </w:r>
-            <w:r>
-              <w:t>ử</w:t>
-            </w:r>
-            <w:r>
-              <w:t>a chén</w:t>
-            </w:r>
+            <w:proofErr w:type="spellStart"/>
+            <w:r>
+              <w:t>Cập</w:t>
+            </w:r>
+            <w:proofErr w:type="spellEnd"/>
+            <w:r>
+              <w:t xml:space="preserve"> </w:t>
+            </w:r>
+            <w:proofErr w:type="spellStart"/>
+            <w:r>
+              <w:t>nhật</w:t>
+            </w:r>
+            <w:proofErr w:type="spellEnd"/>
+            <w:r>
+              <w:t xml:space="preserve"> </w:t>
+            </w:r>
+            <w:proofErr w:type="spellStart"/>
+            <w:r>
+              <w:t>thông</w:t>
+            </w:r>
+            <w:proofErr w:type="spellEnd"/>
+            <w:r>
+              <w:t xml:space="preserve"> tin </w:t>
+            </w:r>
+            <w:proofErr w:type="spellStart"/>
+            <w:r>
+              <w:t>nước</w:t>
+            </w:r>
+            <w:proofErr w:type="spellEnd"/>
+            <w:r>
+              <w:t xml:space="preserve"> </w:t>
+            </w:r>
+            <w:proofErr w:type="spellStart"/>
+            <w:r>
+              <w:t>rửa</w:t>
+            </w:r>
+            <w:proofErr w:type="spellEnd"/>
+            <w:r>
+              <w:t xml:space="preserve"> </w:t>
+            </w:r>
+            <w:proofErr w:type="spellStart"/>
+            <w:r>
+              <w:t>chén</w:t>
+            </w:r>
+            <w:proofErr w:type="spellEnd"/>
+            <w:r>
+              <w:t xml:space="preserve"> </w:t>
+            </w:r>
+            <w:proofErr w:type="spellStart"/>
+            <w:r>
+              <w:t>nhà</w:t>
+            </w:r>
+            <w:proofErr w:type="spellEnd"/>
+            <w:r>
+              <w:t xml:space="preserve"> </w:t>
+            </w:r>
+            <w:proofErr w:type="spellStart"/>
+            <w:r>
+              <w:t>sản</w:t>
+            </w:r>
+            <w:proofErr w:type="spellEnd"/>
+            <w:r>
+              <w:t xml:space="preserve"> </w:t>
+            </w:r>
+            <w:proofErr w:type="spellStart"/>
+            <w:r>
+              <w:t>xuất</w:t>
+            </w:r>
+            <w:proofErr w:type="spellEnd"/>
+            <w:r>
+              <w:t xml:space="preserve"> </w:t>
+            </w:r>
+            <w:proofErr w:type="spellStart"/>
+            <w:r>
+              <w:t>thành</w:t>
+            </w:r>
+            <w:proofErr w:type="spellEnd"/>
+            <w:r>
+              <w:t xml:space="preserve"> </w:t>
+            </w:r>
+            <w:proofErr w:type="spellStart"/>
+            <w:r>
+              <w:t>Mỹ</w:t>
+            </w:r>
+            <w:proofErr w:type="spellEnd"/>
+            <w:r>
+              <w:t xml:space="preserve"> </w:t>
+            </w:r>
+            <w:proofErr w:type="spellStart"/>
+            <w:r>
+              <w:t>Hảo</w:t>
+            </w:r>
+            <w:proofErr w:type="spellEnd"/>
           </w:p>
         </w:tc>
       </w:tr>
@@ -8475,44 +8699,93 @@
             <w:vAlign w:val="center"/>
           </w:tcPr>
           <w:p>
-            <w:r>
-              <w:t>Đ</w:t>
-            </w:r>
-            <w:r>
-              <w:t>ế</w:t>
-            </w:r>
-            <w:r>
-              <w:t>m s</w:t>
+            <w:proofErr w:type="spellStart"/>
+            <w:r>
+              <w:t>Tìm</w:t>
+            </w:r>
+            <w:proofErr w:type="spellEnd"/>
+            <w:r>
+              <w:rPr>
+                <w:lang w:val="vi-VN"/>
+              </w:rPr>
+              <w:t xml:space="preserve"> kiếm</w:t>
+            </w:r>
+            <w:r>
+              <w:t xml:space="preserve"> </w:t>
+            </w:r>
+            <w:proofErr w:type="spellStart"/>
+            <w:r>
+              <w:t>s</w:t>
             </w:r>
             <w:r>
               <w:t>ả</w:t>
             </w:r>
             <w:r>
-              <w:t>n ph</w:t>
+              <w:t>n</w:t>
+            </w:r>
+            <w:proofErr w:type="spellEnd"/>
+            <w:r>
+              <w:t xml:space="preserve"> </w:t>
+            </w:r>
+            <w:proofErr w:type="spellStart"/>
+            <w:r>
+              <w:t>ph</w:t>
             </w:r>
             <w:r>
               <w:t>ẩ</w:t>
             </w:r>
             <w:r>
-              <w:t>m thu</w:t>
+              <w:t>m</w:t>
+            </w:r>
+            <w:proofErr w:type="spellEnd"/>
+            <w:r>
+              <w:t xml:space="preserve"> </w:t>
+            </w:r>
+            <w:proofErr w:type="spellStart"/>
+            <w:r>
+              <w:t>thu</w:t>
             </w:r>
             <w:r>
               <w:t>ộ</w:t>
             </w:r>
             <w:r>
-              <w:t>c lo</w:t>
+              <w:t>c</w:t>
+            </w:r>
+            <w:proofErr w:type="spellEnd"/>
+            <w:r>
+              <w:t xml:space="preserve"> </w:t>
+            </w:r>
+            <w:proofErr w:type="spellStart"/>
+            <w:r>
+              <w:t>lo</w:t>
             </w:r>
             <w:r>
               <w:t>ạ</w:t>
             </w:r>
             <w:r>
-              <w:t>i Th</w:t>
+              <w:t>i</w:t>
+            </w:r>
+            <w:proofErr w:type="spellEnd"/>
+            <w:r>
+              <w:t xml:space="preserve"> </w:t>
+            </w:r>
+            <w:proofErr w:type="spellStart"/>
+            <w:r>
+              <w:t>Th</w:t>
             </w:r>
             <w:r>
               <w:t>ự</w:t>
             </w:r>
             <w:r>
-              <w:t>c ph</w:t>
+              <w:t>c</w:t>
+            </w:r>
+            <w:proofErr w:type="spellEnd"/>
+            <w:r>
+              <w:t xml:space="preserve"> </w:t>
+            </w:r>
+            <w:proofErr w:type="spellStart"/>
+            <w:r>
+              <w:t>ph</w:t>
             </w:r>
             <w:r>
               <w:t>ẩ</w:t>
@@ -8520,6 +8793,7 @@
             <w:r>
               <w:t>m</w:t>
             </w:r>
+            <w:proofErr w:type="spellEnd"/>
           </w:p>
         </w:tc>
         <w:tc>
@@ -8528,6 +8802,12 @@
             <w:vAlign w:val="center"/>
           </w:tcPr>
           <w:p>
+            <w:pPr>
+              <w:rPr>
+                <w:lang w:val="vi-VN"/>
+              </w:rPr>
+            </w:pPr>
+            <w:proofErr w:type="spellStart"/>
             <w:r>
               <w:t>K</w:t>
             </w:r>
@@ -8535,19 +8815,42 @@
               <w:t>ế</w:t>
             </w:r>
             <w:r>
-              <w:t>t qu</w:t>
+              <w:t>t</w:t>
+            </w:r>
+            <w:proofErr w:type="spellEnd"/>
+            <w:r>
+              <w:t xml:space="preserve"> </w:t>
+            </w:r>
+            <w:proofErr w:type="spellStart"/>
+            <w:r>
+              <w:t>qu</w:t>
             </w:r>
             <w:r>
               <w:t>ả</w:t>
             </w:r>
-            <w:r>
-              <w:t xml:space="preserve"> b</w:t>
+            <w:proofErr w:type="spellEnd"/>
+            <w:r>
+              <w:t xml:space="preserve"> </w:t>
+            </w:r>
+            <w:proofErr w:type="spellStart"/>
+            <w:r>
+              <w:t>b</w:t>
             </w:r>
             <w:r>
               <w:t>ằ</w:t>
             </w:r>
             <w:r>
-              <w:t>ng 3</w:t>
+              <w:t>ng</w:t>
+            </w:r>
+            <w:proofErr w:type="spellEnd"/>
+            <w:r>
+              <w:t xml:space="preserve"> 3</w:t>
+            </w:r>
+            <w:r>
+              <w:rPr>
+                <w:lang w:val="vi-VN"/>
+              </w:rPr>
+              <w:t xml:space="preserve"> sản phẩm</w:t>
             </w:r>
           </w:p>
         </w:tc>
@@ -8641,44 +8944,402 @@
     </w:tbl>
     <w:p/>
     <w:p>
-      <w:r>
-        <w:t xml:space="preserve">[Chèn </w:t>
-      </w:r>
-      <w:r>
-        <w:t>ả</w:t>
-      </w:r>
-      <w:r>
-        <w:t>nh ch</w:t>
-      </w:r>
-      <w:r>
-        <w:t>ụ</w:t>
-      </w:r>
-      <w:r>
-        <w:t>p màn hình k</w:t>
-      </w:r>
-      <w:r>
-        <w:t>ế</w:t>
-      </w:r>
-      <w:r>
-        <w:t>t qu</w:t>
-      </w:r>
-      <w:r>
-        <w:t>ả</w:t>
-      </w:r>
-      <w:r>
-        <w:t xml:space="preserve"> ch</w:t>
-      </w:r>
-      <w:r>
-        <w:t>ạ</w:t>
-      </w:r>
-      <w:r>
-        <w:t>y chương trình t</w:t>
-      </w:r>
-      <w:r>
-        <w:t>ạ</w:t>
-      </w:r>
-      <w:r>
-        <w:t>i đây.]</w:t>
+      <w:pPr>
+        <w:pStyle w:val="Heading1"/>
+        <w:rPr>
+          <w:lang w:val="vi-VN"/>
+        </w:rPr>
+      </w:pPr>
+      <w:proofErr w:type="spellStart"/>
+      <w:r>
+        <w:lastRenderedPageBreak/>
+        <w:t>Kết</w:t>
+      </w:r>
+      <w:proofErr w:type="spellEnd"/>
+      <w:r>
+        <w:rPr>
+          <w:lang w:val="vi-VN"/>
+        </w:rPr>
+        <w:t xml:space="preserve"> quả kiểm thử:</w:t>
+      </w:r>
+    </w:p>
+    <w:p>
+      <w:pPr>
+        <w:rPr>
+          <w:b/>
+          <w:lang w:val="vi-VN"/>
+        </w:rPr>
+      </w:pPr>
+      <w:r>
+        <w:rPr>
+          <w:b/>
+          <w:lang w:val="vi-VN"/>
+        </w:rPr>
+        <w:t>Case 1:</w:t>
+      </w:r>
+    </w:p>
+    <w:p>
+      <w:pPr>
+        <w:rPr>
+          <w:lang w:val="vi-VN"/>
+        </w:rPr>
+      </w:pPr>
+      <w:r>
+        <w:rPr>
+          <w:noProof/>
+        </w:rPr>
+        <w:drawing>
+          <wp:inline distT="0" distB="0" distL="0" distR="0" wp14:anchorId="7B01B353" wp14:editId="7A5D79EF">
+            <wp:extent cx="5972175" cy="3528060"/>
+            <wp:effectExtent l="0" t="0" r="9525" b="0"/>
+            <wp:docPr id="2" name="Picture 2"/>
+            <wp:cNvGraphicFramePr>
+              <a:graphicFrameLocks xmlns:a="http://schemas.openxmlformats.org/drawingml/2006/main" noChangeAspect="1"/>
+            </wp:cNvGraphicFramePr>
+            <a:graphic xmlns:a="http://schemas.openxmlformats.org/drawingml/2006/main">
+              <a:graphicData uri="http://schemas.openxmlformats.org/drawingml/2006/picture">
+                <pic:pic xmlns:pic="http://schemas.openxmlformats.org/drawingml/2006/picture">
+                  <pic:nvPicPr>
+                    <pic:cNvPr id="1" name=""/>
+                    <pic:cNvPicPr/>
+                  </pic:nvPicPr>
+                  <pic:blipFill>
+                    <a:blip r:embed="rId7"/>
+                    <a:stretch>
+                      <a:fillRect/>
+                    </a:stretch>
+                  </pic:blipFill>
+                  <pic:spPr>
+                    <a:xfrm>
+                      <a:off x="0" y="0"/>
+                      <a:ext cx="5972175" cy="3528060"/>
+                    </a:xfrm>
+                    <a:prstGeom prst="rect">
+                      <a:avLst/>
+                    </a:prstGeom>
+                  </pic:spPr>
+                </pic:pic>
+              </a:graphicData>
+            </a:graphic>
+          </wp:inline>
+        </w:drawing>
+      </w:r>
+    </w:p>
+    <w:p>
+      <w:pPr>
+        <w:rPr>
+          <w:b/>
+          <w:lang w:val="vi-VN"/>
+        </w:rPr>
+      </w:pPr>
+      <w:r>
+        <w:rPr>
+          <w:b/>
+          <w:lang w:val="vi-VN"/>
+        </w:rPr>
+        <w:t>Case 2:</w:t>
+      </w:r>
+    </w:p>
+    <w:p>
+      <w:pPr>
+        <w:rPr>
+          <w:lang w:val="vi-VN"/>
+        </w:rPr>
+      </w:pPr>
+      <w:r>
+        <w:rPr>
+          <w:noProof/>
+        </w:rPr>
+        <w:drawing>
+          <wp:inline distT="0" distB="0" distL="0" distR="0" wp14:anchorId="7F0A9E1F" wp14:editId="12C90C3D">
+            <wp:extent cx="5972175" cy="3924935"/>
+            <wp:effectExtent l="0" t="0" r="9525" b="0"/>
+            <wp:docPr id="3" name="Picture 3"/>
+            <wp:cNvGraphicFramePr>
+              <a:graphicFrameLocks xmlns:a="http://schemas.openxmlformats.org/drawingml/2006/main" noChangeAspect="1"/>
+            </wp:cNvGraphicFramePr>
+            <a:graphic xmlns:a="http://schemas.openxmlformats.org/drawingml/2006/main">
+              <a:graphicData uri="http://schemas.openxmlformats.org/drawingml/2006/picture">
+                <pic:pic xmlns:pic="http://schemas.openxmlformats.org/drawingml/2006/picture">
+                  <pic:nvPicPr>
+                    <pic:cNvPr id="1" name=""/>
+                    <pic:cNvPicPr/>
+                  </pic:nvPicPr>
+                  <pic:blipFill>
+                    <a:blip r:embed="rId8"/>
+                    <a:stretch>
+                      <a:fillRect/>
+                    </a:stretch>
+                  </pic:blipFill>
+                  <pic:spPr>
+                    <a:xfrm>
+                      <a:off x="0" y="0"/>
+                      <a:ext cx="5972175" cy="3924935"/>
+                    </a:xfrm>
+                    <a:prstGeom prst="rect">
+                      <a:avLst/>
+                    </a:prstGeom>
+                  </pic:spPr>
+                </pic:pic>
+              </a:graphicData>
+            </a:graphic>
+          </wp:inline>
+        </w:drawing>
+      </w:r>
+    </w:p>
+    <w:p>
+      <w:pPr>
+        <w:rPr>
+          <w:b/>
+        </w:rPr>
+      </w:pPr>
+      <w:r>
+        <w:rPr>
+          <w:b/>
+          <w:lang w:val="vi-VN"/>
+        </w:rPr>
+        <w:lastRenderedPageBreak/>
+        <w:t>Case 3:</w:t>
+      </w:r>
+    </w:p>
+    <w:p>
+      <w:pPr>
+        <w:rPr>
+          <w:b/>
+        </w:rPr>
+      </w:pPr>
+      <w:r>
+        <w:rPr>
+          <w:noProof/>
+        </w:rPr>
+        <w:drawing>
+          <wp:inline distT="0" distB="0" distL="0" distR="0" wp14:anchorId="03750DAD" wp14:editId="20E3B1DB">
+            <wp:extent cx="5972175" cy="2660015"/>
+            <wp:effectExtent l="0" t="0" r="9525" b="6985"/>
+            <wp:docPr id="4" name="Picture 4"/>
+            <wp:cNvGraphicFramePr>
+              <a:graphicFrameLocks xmlns:a="http://schemas.openxmlformats.org/drawingml/2006/main" noChangeAspect="1"/>
+            </wp:cNvGraphicFramePr>
+            <a:graphic xmlns:a="http://schemas.openxmlformats.org/drawingml/2006/main">
+              <a:graphicData uri="http://schemas.openxmlformats.org/drawingml/2006/picture">
+                <pic:pic xmlns:pic="http://schemas.openxmlformats.org/drawingml/2006/picture">
+                  <pic:nvPicPr>
+                    <pic:cNvPr id="1" name=""/>
+                    <pic:cNvPicPr/>
+                  </pic:nvPicPr>
+                  <pic:blipFill>
+                    <a:blip r:embed="rId9"/>
+                    <a:stretch>
+                      <a:fillRect/>
+                    </a:stretch>
+                  </pic:blipFill>
+                  <pic:spPr>
+                    <a:xfrm>
+                      <a:off x="0" y="0"/>
+                      <a:ext cx="5972175" cy="2660015"/>
+                    </a:xfrm>
+                    <a:prstGeom prst="rect">
+                      <a:avLst/>
+                    </a:prstGeom>
+                  </pic:spPr>
+                </pic:pic>
+              </a:graphicData>
+            </a:graphic>
+          </wp:inline>
+        </w:drawing>
+      </w:r>
+    </w:p>
+    <w:p>
+      <w:pPr>
+        <w:rPr>
+          <w:b/>
+        </w:rPr>
+      </w:pPr>
+      <w:r>
+        <w:rPr>
+          <w:b/>
+        </w:rPr>
+        <w:t>Case 4:</w:t>
+      </w:r>
+    </w:p>
+    <w:p>
+      <w:pPr>
+        <w:rPr>
+          <w:b/>
+        </w:rPr>
+      </w:pPr>
+      <w:r>
+        <w:rPr>
+          <w:noProof/>
+        </w:rPr>
+        <w:drawing>
+          <wp:inline distT="0" distB="0" distL="0" distR="0" wp14:anchorId="559042D7" wp14:editId="22019C83">
+            <wp:extent cx="5810250" cy="2390775"/>
+            <wp:effectExtent l="0" t="0" r="0" b="9525"/>
+            <wp:docPr id="5" name="Picture 5"/>
+            <wp:cNvGraphicFramePr>
+              <a:graphicFrameLocks xmlns:a="http://schemas.openxmlformats.org/drawingml/2006/main" noChangeAspect="1"/>
+            </wp:cNvGraphicFramePr>
+            <a:graphic xmlns:a="http://schemas.openxmlformats.org/drawingml/2006/main">
+              <a:graphicData uri="http://schemas.openxmlformats.org/drawingml/2006/picture">
+                <pic:pic xmlns:pic="http://schemas.openxmlformats.org/drawingml/2006/picture">
+                  <pic:nvPicPr>
+                    <pic:cNvPr id="1" name=""/>
+                    <pic:cNvPicPr/>
+                  </pic:nvPicPr>
+                  <pic:blipFill>
+                    <a:blip r:embed="rId10"/>
+                    <a:stretch>
+                      <a:fillRect/>
+                    </a:stretch>
+                  </pic:blipFill>
+                  <pic:spPr>
+                    <a:xfrm>
+                      <a:off x="0" y="0"/>
+                      <a:ext cx="5810250" cy="2390775"/>
+                    </a:xfrm>
+                    <a:prstGeom prst="rect">
+                      <a:avLst/>
+                    </a:prstGeom>
+                  </pic:spPr>
+                </pic:pic>
+              </a:graphicData>
+            </a:graphic>
+          </wp:inline>
+        </w:drawing>
+      </w:r>
+    </w:p>
+    <w:p>
+      <w:pPr>
+        <w:rPr>
+          <w:b/>
+          <w:lang w:val="vi-VN"/>
+        </w:rPr>
+      </w:pPr>
+      <w:r>
+        <w:rPr>
+          <w:b/>
+        </w:rPr>
+        <w:t>Case</w:t>
+      </w:r>
+      <w:r>
+        <w:rPr>
+          <w:b/>
+          <w:lang w:val="vi-VN"/>
+        </w:rPr>
+        <w:t xml:space="preserve"> 5:</w:t>
+      </w:r>
+    </w:p>
+    <w:p>
+      <w:pPr>
+        <w:rPr>
+          <w:b/>
+          <w:lang w:val="vi-VN"/>
+        </w:rPr>
+      </w:pPr>
+      <w:r>
+        <w:rPr>
+          <w:noProof/>
+        </w:rPr>
+        <w:lastRenderedPageBreak/>
+        <w:drawing>
+          <wp:inline distT="0" distB="0" distL="0" distR="0" wp14:anchorId="2629E2F2" wp14:editId="4F540FBC">
+            <wp:extent cx="5972175" cy="2640330"/>
+            <wp:effectExtent l="0" t="0" r="9525" b="7620"/>
+            <wp:docPr id="6" name="Picture 6"/>
+            <wp:cNvGraphicFramePr>
+              <a:graphicFrameLocks xmlns:a="http://schemas.openxmlformats.org/drawingml/2006/main" noChangeAspect="1"/>
+            </wp:cNvGraphicFramePr>
+            <a:graphic xmlns:a="http://schemas.openxmlformats.org/drawingml/2006/main">
+              <a:graphicData uri="http://schemas.openxmlformats.org/drawingml/2006/picture">
+                <pic:pic xmlns:pic="http://schemas.openxmlformats.org/drawingml/2006/picture">
+                  <pic:nvPicPr>
+                    <pic:cNvPr id="1" name=""/>
+                    <pic:cNvPicPr/>
+                  </pic:nvPicPr>
+                  <pic:blipFill>
+                    <a:blip r:embed="rId11"/>
+                    <a:stretch>
+                      <a:fillRect/>
+                    </a:stretch>
+                  </pic:blipFill>
+                  <pic:spPr>
+                    <a:xfrm>
+                      <a:off x="0" y="0"/>
+                      <a:ext cx="5972175" cy="2640330"/>
+                    </a:xfrm>
+                    <a:prstGeom prst="rect">
+                      <a:avLst/>
+                    </a:prstGeom>
+                  </pic:spPr>
+                </pic:pic>
+              </a:graphicData>
+            </a:graphic>
+          </wp:inline>
+        </w:drawing>
+      </w:r>
+    </w:p>
+    <w:p>
+      <w:pPr>
+        <w:rPr>
+          <w:b/>
+          <w:lang w:val="vi-VN"/>
+        </w:rPr>
+      </w:pPr>
+      <w:r>
+        <w:rPr>
+          <w:b/>
+          <w:lang w:val="vi-VN"/>
+        </w:rPr>
+        <w:t>Case 6:</w:t>
+      </w:r>
+    </w:p>
+    <w:p>
+      <w:pPr>
+        <w:rPr>
+          <w:b/>
+          <w:lang w:val="vi-VN"/>
+        </w:rPr>
+      </w:pPr>
+      <w:r>
+        <w:rPr>
+          <w:noProof/>
+        </w:rPr>
+        <w:drawing>
+          <wp:inline distT="0" distB="0" distL="0" distR="0" wp14:anchorId="5F4E5E9C" wp14:editId="4DBF686D">
+            <wp:extent cx="5972175" cy="2811145"/>
+            <wp:effectExtent l="0" t="0" r="9525" b="8255"/>
+            <wp:docPr id="7" name="Picture 7"/>
+            <wp:cNvGraphicFramePr>
+              <a:graphicFrameLocks xmlns:a="http://schemas.openxmlformats.org/drawingml/2006/main" noChangeAspect="1"/>
+            </wp:cNvGraphicFramePr>
+            <a:graphic xmlns:a="http://schemas.openxmlformats.org/drawingml/2006/main">
+              <a:graphicData uri="http://schemas.openxmlformats.org/drawingml/2006/picture">
+                <pic:pic xmlns:pic="http://schemas.openxmlformats.org/drawingml/2006/picture">
+                  <pic:nvPicPr>
+                    <pic:cNvPr id="1" name=""/>
+                    <pic:cNvPicPr/>
+                  </pic:nvPicPr>
+                  <pic:blipFill>
+                    <a:blip r:embed="rId12"/>
+                    <a:stretch>
+                      <a:fillRect/>
+                    </a:stretch>
+                  </pic:blipFill>
+                  <pic:spPr>
+                    <a:xfrm>
+                      <a:off x="0" y="0"/>
+                      <a:ext cx="5972175" cy="2811145"/>
+                    </a:xfrm>
+                    <a:prstGeom prst="rect">
+                      <a:avLst/>
+                    </a:prstGeom>
+                  </pic:spPr>
+                </pic:pic>
+              </a:graphicData>
+            </a:graphic>
+          </wp:inline>
+        </w:drawing>
       </w:r>
     </w:p>
     <w:p>
@@ -8915,6 +9576,7 @@
         <w:pStyle w:val="Heading1"/>
       </w:pPr>
       <w:r>
+        <w:lastRenderedPageBreak/>
         <w:t>8. K</w:t>
       </w:r>
       <w:r>
@@ -9179,7 +9841,6 @@
         <w:pStyle w:val="Heading1"/>
       </w:pPr>
       <w:r>
-        <w:lastRenderedPageBreak/>
         <w:t>9. TÀI LI</w:t>
       </w:r>
       <w:r>
@@ -21967,7 +22628,7 @@
 </file>
 
 <file path=customXml/itemProps1.xml><?xml version="1.0" encoding="utf-8"?>
-<ds:datastoreItem xmlns:ds="http://schemas.openxmlformats.org/officeDocument/2006/customXml" ds:itemID="{A5F5D03B-6DEB-45FA-9886-FCC310DFC864}">
+<ds:datastoreItem xmlns:ds="http://schemas.openxmlformats.org/officeDocument/2006/customXml" ds:itemID="{5589DFFC-1C56-4E35-8E18-5D91EF400588}">
   <ds:schemaRefs>
     <ds:schemaRef ds:uri="http://schemas.openxmlformats.org/officeDocument/2006/bibliography"/>
   </ds:schemaRefs>

</xml_diff>